<commit_message>
Paqueta -> Leste (plano proprio AG-07 B4); Penha como 1 plano individual; total 37 PGRS
- 18 individualizados (Penha I+II = 1 plano) + 19 agrupados (novo: Paqueta Leste/B4)
- Mapa, estilo, tabela agrupados e Fase1 sincronizados; Fase1 com lista 'A campanha preve' + 37 visitas

Co-Authored-By: Claude Opus 4.8 <noreply@anthropic.com>
Claude-Session: https://claude.ai/code/session_01RiBxk7VWFWAPqjYN9jBWji
</commit_message>
<xml_diff>
--- a/TR_Fase1_VisitasTecnicas.docx
+++ b/TR_Fase1_VisitasTecnicas.docx
@@ -23,40 +23,7 @@
     </w:p>
     <w:p>
       <w:r>
-        <w:t>A campanha deverá ser dimensionada em 2 (dois) cenários, devendo a CONTRATADA apresentar proposta de preços para cada um deles:</w:t>
-      </w:r>
-    </w:p>
-    <w:p>
-      <w:pPr>
-        <w:pStyle w:val="ListBullet"/>
-      </w:pPr>
-      <w:r>
-        <w:rPr>
-          <w:b/>
-        </w:rPr>
-        <w:t xml:space="preserve">Cenário mínimo (obrigatório): </w:t>
-      </w:r>
-      <w:r>
-        <w:t>no mínimo 14 (quatorze) visitas técnicas, conforme cronograma de amostragem previamente informado e aprovado pela CONTRATANTE, contemplando as unidades individualizadas de maior geração e amostras representativas dos PGRS agrupados;</w:t>
-      </w:r>
-    </w:p>
-    <w:p>
-      <w:pPr>
-        <w:pStyle w:val="ListBullet"/>
-      </w:pPr>
-      <w:r>
-        <w:rPr>
-          <w:b/>
-        </w:rPr>
-        <w:t xml:space="preserve">Cenário desejável (recomendado): </w:t>
-      </w:r>
-      <w:r>
-        <w:t>1 (uma) visita técnica por PGRS elaborado, totalizando 36 (trinta e seis) visitas, de forma a cobrir individualmente cada plano.</w:t>
-      </w:r>
-    </w:p>
-    <w:p>
-      <w:r>
-        <w:t>Em ambos os cenários, cada visita compreende:</w:t>
+        <w:t>A campanha prevê:</w:t>
       </w:r>
     </w:p>
     <w:p>
@@ -97,6 +64,39 @@
       </w:pPr>
       <w:r>
         <w:t>Elaboração de relatório técnico específico da campanha de visitas e gravimetria.</w:t>
+      </w:r>
+    </w:p>
+    <w:p>
+      <w:r>
+        <w:t>O quantitativo de visitas deverá ser dimensionado em 2 (dois) cenários, devendo a CONTRATADA apresentar proposta de preços para cada um deles:</w:t>
+      </w:r>
+    </w:p>
+    <w:p>
+      <w:pPr>
+        <w:pStyle w:val="ListBullet"/>
+      </w:pPr>
+      <w:r>
+        <w:rPr>
+          <w:b/>
+        </w:rPr>
+        <w:t xml:space="preserve">Cenário mínimo (obrigatório): </w:t>
+      </w:r>
+      <w:r>
+        <w:t>no mínimo 14 (quatorze) visitas técnicas, conforme cronograma de amostragem previamente informado e aprovado pela CONTRATANTE, contemplando as unidades individualizadas de maior geração e amostras representativas dos PGRS agrupados;</w:t>
+      </w:r>
+    </w:p>
+    <w:p>
+      <w:pPr>
+        <w:pStyle w:val="ListBullet"/>
+      </w:pPr>
+      <w:r>
+        <w:rPr>
+          <w:b/>
+        </w:rPr>
+        <w:t xml:space="preserve">Cenário desejável (recomendado): </w:t>
+      </w:r>
+      <w:r>
+        <w:t>1 (uma) visita técnica por PGRS elaborado, totalizando 37 (trinta e sete) visitas, de forma a cobrir individualmente cada plano.</w:t>
       </w:r>
     </w:p>
     <w:p>

</xml_diff>